<commit_message>
TRACK-308: added ministers to AS report
</commit_message>
<xml_diff>
--- a/epictrack-api/src/api/reports/report_templates/anticipated_schedule.docx
+++ b/epictrack-api/src/api/reports/report_templates/anticipated_schedule.docx
@@ -1,6 +1,6 @@
 
 <file path=word/document.xml><?xml version="1.0" encoding="utf-8"?>
-<w:document xmlns:o="urn:schemas-microsoft-com:office:office" xmlns:r="http://schemas.openxmlformats.org/officeDocument/2006/relationships" xmlns:v="urn:schemas-microsoft-com:vml" xmlns:w="http://schemas.openxmlformats.org/wordprocessingml/2006/main" xmlns:w10="urn:schemas-microsoft-com:office:word" xmlns:wp="http://schemas.openxmlformats.org/drawingml/2006/wordprocessingDrawing" xmlns:wps="http://schemas.microsoft.com/office/word/2010/wordprocessingShape" xmlns:wpg="http://schemas.microsoft.com/office/word/2010/wordprocessingGroup" xmlns:mc="http://schemas.openxmlformats.org/markup-compatibility/2006" xmlns:wp14="http://schemas.microsoft.com/office/word/2010/wordprocessingDrawing" xmlns:w14="http://schemas.microsoft.com/office/word/2010/wordml" mc:Ignorable="w14 wp14">
+<w:document xmlns:o="urn:schemas-microsoft-com:office:office" xmlns:r="http://schemas.openxmlformats.org/officeDocument/2006/relationships" xmlns:v="urn:schemas-microsoft-com:vml" xmlns:w="http://schemas.openxmlformats.org/wordprocessingml/2006/main" xmlns:w10="urn:schemas-microsoft-com:office:word" xmlns:wp="http://schemas.openxmlformats.org/drawingml/2006/wordprocessingDrawing" xmlns:wps="http://schemas.microsoft.com/office/word/2010/wordprocessingShape" xmlns:wpg="http://schemas.microsoft.com/office/word/2010/wordprocessingGroup" xmlns:mc="http://schemas.openxmlformats.org/markup-compatibility/2006" xmlns:wp14="http://schemas.microsoft.com/office/word/2010/wordprocessingDrawing" xmlns:w14="http://schemas.microsoft.com/office/word/2010/wordml" xmlns:w15="http://schemas.microsoft.com/office/word/2012/wordml" mc:Ignorable="w14 wp14 w15">
   <w:body>
     <w:p>
       <w:pPr>
@@ -167,6 +167,7 @@
         <w:tblW w:w="14417" w:type="dxa"/>
         <w:jc w:val="left"/>
         <w:tblInd w:w="-289" w:type="dxa"/>
+        <w:tblLayout w:type="fixed"/>
         <w:tblCellMar>
           <w:top w:w="0" w:type="dxa"/>
           <w:left w:w="108" w:type="dxa"/>
@@ -195,6 +196,7 @@
           <w:p>
             <w:pPr>
               <w:pStyle w:val="Normal"/>
+              <w:widowControl w:val="false"/>
               <w:ind w:right="360" w:hanging="0"/>
               <w:jc w:val="center"/>
               <w:rPr>
@@ -225,6 +227,7 @@
           <w:p>
             <w:pPr>
               <w:pStyle w:val="Normal"/>
+              <w:widowControl w:val="false"/>
               <w:jc w:val="center"/>
               <w:rPr>
                 <w:rFonts w:cs="Calibri" w:cstheme="minorHAnsi"/>
@@ -255,6 +258,7 @@
           <w:p>
             <w:pPr>
               <w:pStyle w:val="Normal"/>
+              <w:widowControl w:val="false"/>
               <w:jc w:val="center"/>
               <w:rPr>
                 <w:rFonts w:cs="Calibri" w:cstheme="minorHAnsi"/>
@@ -285,6 +289,7 @@
           <w:p>
             <w:pPr>
               <w:pStyle w:val="Normal"/>
+              <w:widowControl w:val="false"/>
               <w:jc w:val="center"/>
               <w:rPr>
                 <w:rFonts w:cs="Calibri" w:cstheme="minorHAnsi"/>
@@ -319,6 +324,7 @@
           <w:p>
             <w:pPr>
               <w:pStyle w:val="Normal"/>
+              <w:widowControl w:val="false"/>
               <w:tabs>
                 <w:tab w:val="clear" w:pos="720"/>
                 <w:tab w:val="left" w:pos="453" w:leader="none"/>
@@ -348,6 +354,7 @@
           <w:p>
             <w:pPr>
               <w:pStyle w:val="Normal"/>
+              <w:widowControl w:val="false"/>
               <w:rPr>
                 <w:rFonts w:cs="Calibri" w:cstheme="minorHAnsi"/>
                 <w:sz w:val="18"/>
@@ -402,23 +409,25 @@
           <w:p>
             <w:pPr>
               <w:pStyle w:val="Normal"/>
-              <w:rPr>
-                <w:rFonts w:cs="Calibri" w:cstheme="minorHAnsi"/>
-                <w:sz w:val="18"/>
-                <w:szCs w:val="18"/>
-              </w:rPr>
-            </w:pPr>
-            <w:r>
-              <w:rPr>
-                <w:rFonts w:cs="Calibri" w:cstheme="minorHAnsi"/>
-                <w:sz w:val="18"/>
-                <w:szCs w:val="18"/>
-              </w:rPr>
-            </w:r>
-          </w:p>
-          <w:p>
-            <w:pPr>
-              <w:pStyle w:val="Normal"/>
+              <w:widowControl w:val="false"/>
+              <w:rPr>
+                <w:rFonts w:cs="Calibri" w:cstheme="minorHAnsi"/>
+                <w:sz w:val="18"/>
+                <w:szCs w:val="18"/>
+              </w:rPr>
+            </w:pPr>
+            <w:r>
+              <w:rPr>
+                <w:rFonts w:cs="Calibri" w:cstheme="minorHAnsi"/>
+                <w:sz w:val="18"/>
+                <w:szCs w:val="18"/>
+              </w:rPr>
+            </w:r>
+          </w:p>
+          <w:p>
+            <w:pPr>
+              <w:pStyle w:val="Normal"/>
+              <w:widowControl w:val="false"/>
               <w:rPr>
                 <w:rFonts w:ascii="Calibri" w:hAnsi="Calibri" w:eastAsia="Calibri"/>
               </w:rPr>
@@ -456,6 +465,7 @@
           <w:p>
             <w:pPr>
               <w:pStyle w:val="Normal"/>
+              <w:widowControl w:val="false"/>
               <w:rPr>
                 <w:rFonts w:cs="Calibri" w:cstheme="minorHAnsi"/>
                 <w:sz w:val="18"/>
@@ -476,6 +486,7 @@
           <w:p>
             <w:pPr>
               <w:pStyle w:val="Normal"/>
+              <w:widowControl w:val="false"/>
               <w:rPr>
                 <w:rFonts w:cs="Calibri" w:cstheme="minorHAnsi"/>
                 <w:sz w:val="18"/>
@@ -516,6 +527,7 @@
           <w:p>
             <w:pPr>
               <w:pStyle w:val="Normal"/>
+              <w:widowControl w:val="false"/>
               <w:rPr>
                 <w:rFonts w:cs="Calibri" w:cstheme="minorHAnsi"/>
                 <w:sz w:val="18"/>
@@ -536,6 +548,7 @@
           <w:p>
             <w:pPr>
               <w:pStyle w:val="Normal"/>
+              <w:widowControl w:val="false"/>
               <w:rPr>
                 <w:rFonts w:cs="Calibri" w:cstheme="minorHAnsi"/>
                 <w:sz w:val="18"/>
@@ -576,6 +589,7 @@
           <w:p>
             <w:pPr>
               <w:pStyle w:val="Normal"/>
+              <w:widowControl w:val="false"/>
               <w:rPr>
                 <w:rFonts w:cs="Calibri" w:cstheme="minorHAnsi"/>
                 <w:sz w:val="18"/>
@@ -596,6 +610,7 @@
           <w:p>
             <w:pPr>
               <w:pStyle w:val="Normal"/>
+              <w:widowControl w:val="false"/>
               <w:spacing w:lineRule="atLeast" w:line="201"/>
               <w:rPr>
                 <w:rFonts w:cs="Calibri" w:cstheme="minorHAnsi"/>
@@ -629,6 +644,7 @@
           <w:p>
             <w:pPr>
               <w:pStyle w:val="Normal"/>
+              <w:widowControl w:val="false"/>
               <w:spacing w:lineRule="atLeast" w:line="201"/>
               <w:rPr>
                 <w:rFonts w:cs="Calibri" w:cstheme="minorHAnsi"/>
@@ -638,12 +654,18 @@
               </w:rPr>
             </w:pPr>
             <w:r>
-              <w:rPr/>
-            </w:r>
-          </w:p>
-          <w:p>
-            <w:pPr>
-              <w:pStyle w:val="Normal"/>
+              <w:rPr>
+                <w:rFonts w:cs="Calibri" w:cstheme="minorHAnsi"/>
+                <w:sz w:val="18"/>
+                <w:szCs w:val="18"/>
+                <w:lang w:val="en-US"/>
+              </w:rPr>
+            </w:r>
+          </w:p>
+          <w:p>
+            <w:pPr>
+              <w:pStyle w:val="Normal"/>
+              <w:widowControl w:val="false"/>
               <w:spacing w:lineRule="atLeast" w:line="201"/>
               <w:rPr>
                 <w:rFonts w:cs="Calibri" w:cstheme="minorHAnsi"/>
@@ -661,24 +683,87 @@
                 <w:szCs w:val="18"/>
                 <w:lang w:val="en-US"/>
               </w:rPr>
-              <w:t xml:space="preserve">Decision to be made by: </w:t>
-            </w:r>
-            <w:r>
-              <w:rPr>
-                <w:rFonts w:eastAsia="Calibri" w:cs="Calibri" w:cstheme="minorHAnsi"/>
-                <w:bCs/>
-                <w:sz w:val="18"/>
-                <w:szCs w:val="18"/>
-                <w:lang w:val="en-US"/>
-              </w:rPr>
-              <w:t>{$item_val[i].milestone_type:ifEQ(4):showBegin}Minister {$item_val[i].eac_decision_by}{$item_val[i].milestone_type:showEnd}</w:t>
-              <w:br/>
-              <w:t>{$item_val[i].milestone_type:ifNE(4):showBegin}{$item_val[i].decision_by}{$item_val[i].milestone_type:showEnd}</w:t>
-            </w:r>
-          </w:p>
-          <w:p>
-            <w:pPr>
-              <w:pStyle w:val="Normal"/>
+              <w:t xml:space="preserve">Decision to be made by:: </w:t>
+            </w:r>
+            <w:r>
+              <w:rPr>
+                <w:rFonts w:eastAsia="Calibri" w:cs="Calibri" w:cstheme="minorHAnsi"/>
+                <w:b/>
+                <w:sz w:val="18"/>
+                <w:szCs w:val="18"/>
+                <w:lang w:val="en-US"/>
+              </w:rPr>
+              <w:t>|</w:t>
+            </w:r>
+            <w:r>
+              <w:rPr>
+                <w:rFonts w:eastAsia="Calibri" w:cs="Calibri" w:cstheme="minorHAnsi"/>
+                <w:b/>
+                <w:sz w:val="18"/>
+                <w:szCs w:val="18"/>
+                <w:lang w:val="en-US"/>
+              </w:rPr>
+              <w:t xml:space="preserve"> </w:t>
+            </w:r>
+            <w:r>
+              <w:rPr>
+                <w:rFonts w:eastAsia="Calibri" w:cs="Calibri" w:cstheme="minorHAnsi"/>
+                <w:bCs/>
+                <w:sz w:val="18"/>
+                <w:szCs w:val="18"/>
+                <w:lang w:val="en-US"/>
+              </w:rPr>
+              <w:t>{$item_val[i].decision_by</w:t>
+            </w:r>
+            <w:r>
+              <w:rPr>
+                <w:rFonts w:eastAsia="Calibri" w:cs="Calibri" w:cstheme="minorHAnsi"/>
+                <w:bCs/>
+                <w:sz w:val="18"/>
+                <w:szCs w:val="18"/>
+                <w:lang w:val="en-US"/>
+              </w:rPr>
+              <w:t>}</w:t>
+            </w:r>
+          </w:p>
+          <w:p>
+            <w:pPr>
+              <w:pStyle w:val="Normal"/>
+              <w:widowControl w:val="false"/>
+              <w:spacing w:lineRule="atLeast" w:line="201"/>
+              <w:rPr>
+                <w:rFonts w:cs="Calibri" w:cstheme="minorHAnsi"/>
+                <w:bCs/>
+                <w:sz w:val="18"/>
+                <w:szCs w:val="18"/>
+                <w:lang w:val="en-US"/>
+              </w:rPr>
+            </w:pPr>
+            <w:r>
+              <w:rPr>
+                <w:rFonts w:eastAsia="Calibri" w:cs="Calibri" w:cstheme="minorHAnsi"/>
+                <w:bCs/>
+                <w:sz w:val="18"/>
+                <w:szCs w:val="18"/>
+                <w:lang w:val="en-US"/>
+              </w:rPr>
+              <w:t>{</w:t>
+            </w:r>
+            <w:r>
+              <w:rPr>
+                <w:rFonts w:eastAsia="Calibri" w:cs="Calibri" w:cstheme="minorHAnsi"/>
+                <w:bCs/>
+                <w:sz w:val="18"/>
+                <w:szCs w:val="18"/>
+                <w:lang w:val="en-US"/>
+              </w:rPr>
+              <w:t>$item_val[i].minister}</w:t>
+            </w:r>
+          </w:p>
+          <w:p>
+            <w:pPr>
+              <w:pStyle w:val="Normal"/>
+              <w:widowControl w:val="false"/>
               <w:spacing w:lineRule="atLeast" w:line="201"/>
               <w:rPr>
                 <w:rFonts w:cs="Calibri" w:cstheme="minorHAnsi"/>
@@ -708,6 +793,7 @@
           <w:p>
             <w:pPr>
               <w:pStyle w:val="Normal"/>
+              <w:widowControl w:val="false"/>
               <w:rPr>
                 <w:rFonts w:cs="Calibri" w:cstheme="minorHAnsi"/>
                 <w:sz w:val="18"/>
@@ -748,25 +834,27 @@
           <w:p>
             <w:pPr>
               <w:pStyle w:val="Normal"/>
-              <w:rPr>
-                <w:rFonts w:cs="Calibri" w:cstheme="minorHAnsi"/>
-                <w:sz w:val="18"/>
-                <w:szCs w:val="18"/>
-                <w:lang w:val="en-US"/>
-              </w:rPr>
-            </w:pPr>
-            <w:r>
-              <w:rPr>
-                <w:rFonts w:cs="Calibri" w:cstheme="minorHAnsi"/>
-                <w:sz w:val="18"/>
-                <w:szCs w:val="18"/>
-                <w:lang w:val="en-US"/>
-              </w:rPr>
-            </w:r>
-          </w:p>
-          <w:p>
-            <w:pPr>
-              <w:pStyle w:val="Normal"/>
+              <w:widowControl w:val="false"/>
+              <w:rPr>
+                <w:rFonts w:cs="Calibri" w:cstheme="minorHAnsi"/>
+                <w:sz w:val="18"/>
+                <w:szCs w:val="18"/>
+                <w:lang w:val="en-US"/>
+              </w:rPr>
+            </w:pPr>
+            <w:r>
+              <w:rPr>
+                <w:rFonts w:cs="Calibri" w:cstheme="minorHAnsi"/>
+                <w:sz w:val="18"/>
+                <w:szCs w:val="18"/>
+                <w:lang w:val="en-US"/>
+              </w:rPr>
+            </w:r>
+          </w:p>
+          <w:p>
+            <w:pPr>
+              <w:pStyle w:val="Normal"/>
+              <w:widowControl w:val="false"/>
               <w:rPr>
                 <w:rFonts w:cs="Calibri" w:cstheme="minorHAnsi"/>
                 <w:sz w:val="18"/>
@@ -813,6 +901,7 @@
           <w:p>
             <w:pPr>
               <w:pStyle w:val="Normal"/>
+              <w:widowControl w:val="false"/>
               <w:rPr>
                 <w:rFonts w:eastAsia="Calibri" w:cs="Calibri" w:cstheme="minorHAnsi"/>
                 <w:sz w:val="18"/>
@@ -849,6 +938,7 @@
           <w:p>
             <w:pPr>
               <w:pStyle w:val="Normal"/>
+              <w:widowControl w:val="false"/>
               <w:rPr>
                 <w:rFonts w:eastAsia="Calibri" w:cs="Calibri" w:cstheme="minorHAnsi"/>
                 <w:bCs/>
@@ -887,6 +977,7 @@
           <w:p>
             <w:pPr>
               <w:pStyle w:val="Normal"/>
+              <w:widowControl w:val="false"/>
               <w:rPr>
                 <w:rFonts w:eastAsia="Calibri" w:cs="Calibri" w:cstheme="minorHAnsi"/>
                 <w:bCs/>
@@ -935,6 +1026,7 @@
           <w:p>
             <w:pPr>
               <w:pStyle w:val="Normal"/>
+              <w:widowControl w:val="false"/>
               <w:rPr>
                 <w:rFonts w:eastAsia="Calibri" w:cs="Calibri" w:cstheme="minorHAnsi"/>
                 <w:sz w:val="18"/>
@@ -955,6 +1047,7 @@
           <w:p>
             <w:pPr>
               <w:pStyle w:val="Normal"/>
+              <w:widowControl w:val="false"/>
               <w:rPr>
                 <w:rFonts w:eastAsia="Calibri" w:cs="Calibri" w:cstheme="minorHAnsi"/>
                 <w:sz w:val="18"/>
@@ -1002,6 +1095,7 @@
           <w:p>
             <w:pPr>
               <w:pStyle w:val="Normal"/>
+              <w:widowControl w:val="false"/>
               <w:rPr>
                 <w:rFonts w:eastAsia="Calibri"/>
                 <w:sz w:val="18"/>
@@ -1020,6 +1114,7 @@
           <w:p>
             <w:pPr>
               <w:pStyle w:val="Normal"/>
+              <w:widowControl w:val="false"/>
               <w:rPr>
                 <w:rFonts w:eastAsia="Calibri"/>
                 <w:sz w:val="18"/>
@@ -1047,6 +1142,7 @@
           <w:p>
             <w:pPr>
               <w:pStyle w:val="Normal"/>
+              <w:widowControl w:val="false"/>
               <w:rPr>
                 <w:rFonts w:eastAsia="Calibri" w:cs="Calibri" w:cstheme="minorHAnsi"/>
                 <w:sz w:val="18"/>
@@ -1065,6 +1161,7 @@
           <w:p>
             <w:pPr>
               <w:pStyle w:val="Normal"/>
+              <w:widowControl w:val="false"/>
               <w:rPr>
                 <w:rFonts w:eastAsia="Calibri" w:cs="Calibri" w:cstheme="minorHAnsi"/>
                 <w:sz w:val="18"/>
@@ -1093,7 +1190,7 @@
       </w:tr>
       <w:tr>
         <w:trPr>
-          <w:trHeight w:val="2707" w:hRule="atLeast"/>
+          <w:trHeight w:val="4320" w:hRule="atLeast"/>
         </w:trPr>
         <w:tc>
           <w:tcPr>
@@ -1104,13 +1201,8 @@
           <w:p>
             <w:pPr>
               <w:pStyle w:val="Normal"/>
-              <w:rPr>
-                <w:rFonts w:cs="Calibri" w:cstheme="minorHAnsi"/>
-                <w:b/>
-                <w:b/>
-                <w:sz w:val="20"/>
-                <w:szCs w:val="20"/>
-              </w:rPr>
+              <w:widowControl w:val="false"/>
+              <w:rPr/>
             </w:pPr>
             <w:r>
               <w:rPr>
@@ -1132,48 +1224,45 @@
           <w:p>
             <w:pPr>
               <w:pStyle w:val="Normal"/>
-              <w:rPr>
-                <w:rFonts w:cs="Calibri" w:cstheme="minorHAnsi"/>
+              <w:widowControl w:val="false"/>
+              <w:rPr/>
+            </w:pPr>
+            <w:r>
+              <w:rPr>
+                <w:rFonts w:eastAsia="Calibri" w:cs="Calibri" w:cstheme="minorHAnsi"/>
+                <w:sz w:val="18"/>
+                <w:szCs w:val="18"/>
+              </w:rPr>
+              <w:t>{$item_val[i+1].project_name:ifNEM():showBegin}</w:t>
+            </w:r>
+            <w:r>
+              <w:rPr>
+                <w:rFonts w:eastAsia="Calibri" w:cs="Calibri" w:cstheme="minorHAnsi"/>
+                <w:b/>
+                <w:bCs/>
                 <w:sz w:val="24"/>
                 <w:szCs w:val="24"/>
               </w:rPr>
-            </w:pPr>
-            <w:r>
-              <w:rPr>
-                <w:rFonts w:eastAsia="Calibri" w:cs="Calibri" w:cstheme="minorHAnsi"/>
-                <w:sz w:val="18"/>
-                <w:szCs w:val="18"/>
-              </w:rPr>
-              <w:t>{$item_val[i+1].project_name:ifNEM():showBegin}</w:t>
-            </w:r>
-            <w:r>
-              <w:rPr>
-                <w:rFonts w:eastAsia="Calibri" w:cs="Calibri" w:cstheme="minorHAnsi"/>
+              <w:t>{$item_val[i+1].</w:t>
+            </w:r>
+            <w:r>
+              <w:rPr>
+                <w:rFonts w:eastAsia="Calibri"/>
                 <w:b/>
                 <w:bCs/>
                 <w:sz w:val="24"/>
                 <w:szCs w:val="24"/>
               </w:rPr>
-              <w:t>{$item_val[i+1].</w:t>
-            </w:r>
-            <w:r>
-              <w:rPr>
-                <w:rFonts w:eastAsia="Calibri"/>
+              <w:t>p</w:t>
+            </w:r>
+            <w:r>
+              <w:rPr>
+                <w:rFonts w:eastAsia="Calibri" w:cs="Calibri" w:cstheme="minorHAnsi"/>
                 <w:b/>
                 <w:bCs/>
                 <w:sz w:val="24"/>
                 <w:szCs w:val="24"/>
               </w:rPr>
-              <w:t>p</w:t>
-            </w:r>
-            <w:r>
-              <w:rPr>
-                <w:rFonts w:eastAsia="Calibri" w:cs="Calibri" w:cstheme="minorHAnsi"/>
-                <w:b/>
-                <w:bCs/>
-                <w:sz w:val="24"/>
-                <w:szCs w:val="24"/>
-              </w:rPr>
               <w:t>roject_name}</w:t>
             </w:r>
             <w:r>
@@ -1188,14 +1277,8 @@
           <w:p>
             <w:pPr>
               <w:pStyle w:val="Normal"/>
-              <w:rPr>
-                <w:rFonts w:cs="Calibri" w:cstheme="minorHAnsi"/>
-                <w:b/>
-                <w:b/>
-                <w:bCs/>
-                <w:sz w:val="18"/>
-                <w:szCs w:val="18"/>
-              </w:rPr>
+              <w:widowControl w:val="false"/>
+              <w:rPr/>
             </w:pPr>
             <w:r>
               <w:rPr>
@@ -1210,12 +1293,8 @@
           <w:p>
             <w:pPr>
               <w:pStyle w:val="Normal"/>
-              <w:rPr>
-                <w:rFonts w:cs="Calibri" w:cstheme="minorHAnsi"/>
-                <w:sz w:val="18"/>
-                <w:szCs w:val="18"/>
-                <w:lang w:val="en-US"/>
-              </w:rPr>
+              <w:widowControl w:val="false"/>
+              <w:rPr/>
             </w:pPr>
             <w:r>
               <w:rPr>
@@ -1241,12 +1320,8 @@
           <w:p>
             <w:pPr>
               <w:pStyle w:val="Normal"/>
-              <w:rPr>
-                <w:rFonts w:cs="Calibri" w:cstheme="minorHAnsi"/>
-                <w:sz w:val="18"/>
-                <w:szCs w:val="18"/>
-                <w:lang w:val="en-US"/>
-              </w:rPr>
+              <w:widowControl w:val="false"/>
+              <w:rPr/>
             </w:pPr>
             <w:r>
               <w:rPr>
@@ -1261,15 +1336,8 @@
           <w:p>
             <w:pPr>
               <w:pStyle w:val="Normal"/>
-              <w:rPr>
-                <w:rFonts w:cs="Calibri" w:cstheme="minorHAnsi"/>
-                <w:b/>
-                <w:b/>
-                <w:bCs/>
-                <w:sz w:val="18"/>
-                <w:szCs w:val="18"/>
-                <w:lang w:val="en-US"/>
-              </w:rPr>
+              <w:widowControl w:val="false"/>
+              <w:rPr/>
             </w:pPr>
             <w:r>
               <w:rPr>
@@ -1284,12 +1352,8 @@
           <w:p>
             <w:pPr>
               <w:pStyle w:val="Normal"/>
-              <w:rPr>
-                <w:rFonts w:cs="Calibri" w:cstheme="minorHAnsi"/>
-                <w:sz w:val="18"/>
-                <w:szCs w:val="18"/>
-                <w:lang w:val="en-US"/>
-              </w:rPr>
+              <w:widowControl w:val="false"/>
+              <w:rPr/>
             </w:pPr>
             <w:r>
               <w:rPr>
@@ -1315,12 +1379,8 @@
           <w:p>
             <w:pPr>
               <w:pStyle w:val="Normal"/>
-              <w:rPr>
-                <w:rFonts w:cs="Calibri" w:cstheme="minorHAnsi"/>
-                <w:sz w:val="18"/>
-                <w:szCs w:val="18"/>
-                <w:lang w:val="en-US"/>
-              </w:rPr>
+              <w:widowControl w:val="false"/>
+              <w:rPr/>
             </w:pPr>
             <w:r>
               <w:rPr>
@@ -1335,12 +1395,8 @@
           <w:p>
             <w:pPr>
               <w:pStyle w:val="Normal"/>
-              <w:rPr>
-                <w:rFonts w:cs="Calibri" w:cstheme="minorHAnsi"/>
-                <w:sz w:val="18"/>
-                <w:szCs w:val="18"/>
-                <w:lang w:val="en-US"/>
-              </w:rPr>
+              <w:widowControl w:val="false"/>
+              <w:rPr/>
             </w:pPr>
             <w:r>
               <w:rPr>
@@ -1355,12 +1411,8 @@
           <w:p>
             <w:pPr>
               <w:pStyle w:val="Normal"/>
-              <w:rPr>
-                <w:rFonts w:cs="Calibri" w:cstheme="minorHAnsi"/>
-                <w:sz w:val="18"/>
-                <w:szCs w:val="18"/>
-                <w:lang w:val="en-US"/>
-              </w:rPr>
+              <w:widowControl w:val="false"/>
+              <w:rPr/>
             </w:pPr>
             <w:r>
               <w:rPr>
@@ -1386,12 +1438,8 @@
           <w:p>
             <w:pPr>
               <w:pStyle w:val="Normal"/>
-              <w:rPr>
-                <w:rFonts w:cs="Calibri" w:cstheme="minorHAnsi"/>
-                <w:sz w:val="18"/>
-                <w:szCs w:val="18"/>
-                <w:lang w:val="en-US"/>
-              </w:rPr>
+              <w:widowControl w:val="false"/>
+              <w:rPr/>
             </w:pPr>
             <w:r>
               <w:rPr>
@@ -1406,12 +1454,8 @@
           <w:p>
             <w:pPr>
               <w:pStyle w:val="Normal"/>
-              <w:rPr>
-                <w:rFonts w:cs="Calibri" w:cstheme="minorHAnsi"/>
-                <w:sz w:val="18"/>
-                <w:szCs w:val="18"/>
-                <w:lang w:val="en-US"/>
-              </w:rPr>
+              <w:widowControl w:val="false"/>
+              <w:rPr/>
             </w:pPr>
             <w:r>
               <w:rPr>
@@ -1427,13 +1471,9 @@
           <w:p>
             <w:pPr>
               <w:pStyle w:val="Normal"/>
+              <w:widowControl w:val="false"/>
               <w:spacing w:lineRule="atLeast" w:line="201"/>
-              <w:rPr>
-                <w:rFonts w:cs="Calibri" w:cstheme="minorHAnsi"/>
-                <w:sz w:val="18"/>
-                <w:szCs w:val="18"/>
-                <w:lang w:val="en-US"/>
-              </w:rPr>
+              <w:rPr/>
             </w:pPr>
             <w:r>
               <w:rPr>
@@ -1516,34 +1556,65 @@
           <w:p>
             <w:pPr>
               <w:pStyle w:val="Normal"/>
-              <w:rPr>
-                <w:rFonts w:cs="Calibri" w:cstheme="minorHAnsi"/>
-                <w:b/>
-                <w:b/>
-                <w:bCs/>
-                <w:sz w:val="24"/>
-                <w:szCs w:val="24"/>
-              </w:rPr>
-            </w:pPr>
-            <w:r>
-              <w:rPr>
-                <w:rFonts w:eastAsia="Calibri" w:cs="Calibri" w:cstheme="minorHAnsi"/>
-                <w:b/>
-                <w:sz w:val="18"/>
-                <w:szCs w:val="18"/>
-                <w:lang w:val="en-US"/>
-              </w:rPr>
-              <w:t xml:space="preserve">Decision to be made by: </w:t>
-            </w:r>
-            <w:r>
-              <w:rPr>
-                <w:rFonts w:eastAsia="Calibri" w:cs="Calibri" w:cstheme="minorHAnsi"/>
-                <w:bCs/>
-                <w:sz w:val="18"/>
-                <w:szCs w:val="18"/>
-                <w:lang w:val="en-US"/>
-              </w:rPr>
-              <w:t>{$item_val[i+1].milestone_type:ifEQ(4):showBegin}Minister {$item_val[i+1].eac_decision_by}{$item_val[i+1].milestone_type:showEnd}{$item_val[i+1].milestone_type:ifNE(4):showBegin}{$item_val[i+1].decision_by}{$item_val[i+1].milestone_type:showEnd}</w:t>
+              <w:widowControl w:val="false"/>
+              <w:rPr/>
+            </w:pPr>
+            <w:r>
+              <w:rPr>
+                <w:rFonts w:eastAsia="Calibri" w:cs="Calibri" w:cstheme="minorHAnsi"/>
+                <w:b/>
+                <w:sz w:val="18"/>
+                <w:szCs w:val="18"/>
+                <w:lang w:val="en-US"/>
+              </w:rPr>
+              <w:t>Decision to be made by: :</w:t>
+            </w:r>
+            <w:r>
+              <w:rPr>
+                <w:rFonts w:eastAsia="Calibri" w:cs="Calibri" w:cstheme="minorHAnsi"/>
+                <w:b/>
+                <w:sz w:val="18"/>
+                <w:szCs w:val="18"/>
+                <w:lang w:val="en-US"/>
+              </w:rPr>
+              <w:t>|</w:t>
+            </w:r>
+            <w:r>
+              <w:rPr>
+                <w:rFonts w:eastAsia="Calibri" w:cs="Calibri" w:cstheme="minorHAnsi"/>
+                <w:b/>
+                <w:sz w:val="18"/>
+                <w:szCs w:val="18"/>
+                <w:lang w:val="en-US"/>
+              </w:rPr>
+              <w:t xml:space="preserve"> </w:t>
+            </w:r>
+            <w:r>
+              <w:rPr>
+                <w:rFonts w:eastAsia="Calibri" w:cs="Calibri" w:cstheme="minorHAnsi"/>
+                <w:bCs/>
+                <w:sz w:val="18"/>
+                <w:szCs w:val="18"/>
+                <w:lang w:val="en-US"/>
+              </w:rPr>
+              <w:t>{$item_val[i+1].decision_by}</w:t>
+            </w:r>
+          </w:p>
+          <w:p>
+            <w:pPr>
+              <w:pStyle w:val="Normal"/>
+              <w:widowControl w:val="false"/>
+              <w:rPr/>
+            </w:pPr>
+            <w:r>
+              <w:rPr>
+                <w:rFonts w:eastAsia="Calibri" w:cs="Calibri" w:cstheme="minorHAnsi"/>
+                <w:bCs/>
+                <w:sz w:val="18"/>
+                <w:szCs w:val="18"/>
+                <w:lang w:val="en-US"/>
+              </w:rPr>
+              <w:t>{$item_val[i+1].minister}</w:t>
             </w:r>
           </w:p>
         </w:tc>
@@ -1556,6 +1627,7 @@
           <w:p>
             <w:pPr>
               <w:pStyle w:val="Normal"/>
+              <w:widowControl w:val="false"/>
               <w:rPr>
                 <w:rFonts w:cs="Calibri" w:cstheme="minorHAnsi"/>
                 <w:sz w:val="18"/>
@@ -1576,6 +1648,7 @@
           <w:p>
             <w:pPr>
               <w:pStyle w:val="Normal"/>
+              <w:widowControl w:val="false"/>
               <w:rPr>
                 <w:rFonts w:cs="Calibri" w:cstheme="minorHAnsi"/>
                 <w:sz w:val="18"/>
@@ -1595,6 +1668,7 @@
           <w:p>
             <w:pPr>
               <w:pStyle w:val="Normal"/>
+              <w:widowControl w:val="false"/>
               <w:rPr>
                 <w:rFonts w:cs="Calibri" w:cstheme="minorHAnsi"/>
                 <w:sz w:val="20"/>
@@ -1621,6 +1695,7 @@
           <w:p>
             <w:pPr>
               <w:pStyle w:val="Normal"/>
+              <w:widowControl w:val="false"/>
               <w:rPr>
                 <w:rFonts w:cs="Calibri" w:cstheme="minorHAnsi"/>
                 <w:bCs/>
@@ -1688,6 +1763,7 @@
           <w:p>
             <w:pPr>
               <w:pStyle w:val="Normal"/>
+              <w:widowControl w:val="false"/>
               <w:rPr>
                 <w:rFonts w:cs="Calibri" w:cstheme="minorHAnsi"/>
                 <w:bCs/>
@@ -1707,6 +1783,7 @@
           <w:p>
             <w:pPr>
               <w:pStyle w:val="Normal"/>
+              <w:widowControl w:val="false"/>
               <w:spacing w:lineRule="atLeast" w:line="201"/>
               <w:rPr>
                 <w:rFonts w:cs="Calibri" w:cstheme="minorHAnsi"/>
@@ -1748,6 +1825,7 @@
           <w:p>
             <w:pPr>
               <w:pStyle w:val="Normal"/>
+              <w:widowControl w:val="false"/>
               <w:spacing w:lineRule="atLeast" w:line="201"/>
               <w:rPr>
                 <w:rFonts w:cs="Calibri" w:cstheme="minorHAnsi"/>
@@ -1777,6 +1855,7 @@
           <w:p>
             <w:pPr>
               <w:pStyle w:val="Normal"/>
+              <w:widowControl w:val="false"/>
               <w:spacing w:lineRule="atLeast" w:line="201"/>
               <w:rPr>
                 <w:rFonts w:cs="Calibri" w:cstheme="minorHAnsi"/>
@@ -1798,6 +1877,7 @@
           <w:p>
             <w:pPr>
               <w:pStyle w:val="Normal"/>
+              <w:widowControl w:val="false"/>
               <w:spacing w:lineRule="atLeast" w:line="201"/>
               <w:rPr>
                 <w:rFonts w:cs="Calibri" w:cstheme="minorHAnsi"/>
@@ -1847,6 +1927,7 @@
           <w:p>
             <w:pPr>
               <w:pStyle w:val="Normal"/>
+              <w:widowControl w:val="false"/>
               <w:spacing w:lineRule="atLeast" w:line="201"/>
               <w:rPr>
                 <w:rFonts w:cs="Calibri" w:cstheme="minorHAnsi"/>
@@ -1876,6 +1957,7 @@
           <w:p>
             <w:pPr>
               <w:pStyle w:val="Normal"/>
+              <w:widowControl w:val="false"/>
               <w:spacing w:lineRule="atLeast" w:line="201"/>
               <w:rPr>
                 <w:rFonts w:cs="Calibri" w:cstheme="minorHAnsi"/>
@@ -1914,6 +1996,7 @@
           <w:p>
             <w:pPr>
               <w:pStyle w:val="Normal"/>
+              <w:widowControl w:val="false"/>
               <w:spacing w:lineRule="atLeast" w:line="201"/>
               <w:rPr>
                 <w:rFonts w:cs="Calibri" w:cstheme="minorHAnsi"/>
@@ -1955,6 +2038,7 @@
           <w:p>
             <w:pPr>
               <w:pStyle w:val="Normal"/>
+              <w:widowControl w:val="false"/>
               <w:spacing w:lineRule="atLeast" w:line="201"/>
               <w:rPr>
                 <w:rFonts w:cs="Calibri" w:cstheme="minorHAnsi"/>
@@ -1984,6 +2068,7 @@
           <w:p>
             <w:pPr>
               <w:pStyle w:val="Normal"/>
+              <w:widowControl w:val="false"/>
               <w:spacing w:lineRule="atLeast" w:line="201"/>
               <w:rPr>
                 <w:rFonts w:cs="Calibri" w:cstheme="minorHAnsi"/>
@@ -2005,6 +2090,7 @@
           <w:p>
             <w:pPr>
               <w:pStyle w:val="Normal"/>
+              <w:widowControl w:val="false"/>
               <w:rPr>
                 <w:rFonts w:cs="Calibri" w:cstheme="minorHAnsi"/>
                 <w:b/>
@@ -2026,6 +2112,7 @@
           <w:p>
             <w:pPr>
               <w:pStyle w:val="Normal"/>
+              <w:widowControl w:val="false"/>
               <w:rPr>
                 <w:rFonts w:cs="Calibri" w:cstheme="minorHAnsi"/>
                 <w:sz w:val="18"/>
@@ -2062,6 +2149,7 @@
           <w:p>
             <w:pPr>
               <w:pStyle w:val="Normal"/>
+              <w:widowControl w:val="false"/>
               <w:rPr>
                 <w:rFonts w:cs="Calibri" w:cstheme="minorHAnsi"/>
                 <w:sz w:val="20"/>
@@ -2129,7 +2217,7 @@
       <w:footerReference w:type="first" r:id="rId5"/>
       <w:type w:val="nextPage"/>
       <w:pgSz w:orient="landscape" w:w="15840" w:h="12240"/>
-      <w:pgMar w:left="851" w:right="851" w:header="624" w:top="681" w:footer="709" w:bottom="766" w:gutter="0"/>
+      <w:pgMar w:left="851" w:right="851" w:gutter="0" w:header="624" w:top="681" w:footer="709" w:bottom="766"/>
       <w:pgNumType w:fmt="decimal"/>
       <w:formProt w:val="false"/>
       <w:titlePg/>
@@ -2141,7 +2229,7 @@
 </file>
 
 <file path=word/footer1.xml><?xml version="1.0" encoding="utf-8"?>
-<w:ftr xmlns:o="urn:schemas-microsoft-com:office:office" xmlns:r="http://schemas.openxmlformats.org/officeDocument/2006/relationships" xmlns:v="urn:schemas-microsoft-com:vml" xmlns:w="http://schemas.openxmlformats.org/wordprocessingml/2006/main" xmlns:w10="urn:schemas-microsoft-com:office:word" xmlns:wp="http://schemas.openxmlformats.org/drawingml/2006/wordprocessingDrawing" xmlns:wps="http://schemas.microsoft.com/office/word/2010/wordprocessingShape" xmlns:wpg="http://schemas.microsoft.com/office/word/2010/wordprocessingGroup" xmlns:mc="http://schemas.openxmlformats.org/markup-compatibility/2006" xmlns:wp14="http://schemas.microsoft.com/office/word/2010/wordprocessingDrawing" xmlns:w14="http://schemas.microsoft.com/office/word/2010/wordml" mc:Ignorable="w14 wp14">
+<w:ftr xmlns:o="urn:schemas-microsoft-com:office:office" xmlns:r="http://schemas.openxmlformats.org/officeDocument/2006/relationships" xmlns:v="urn:schemas-microsoft-com:vml" xmlns:w="http://schemas.openxmlformats.org/wordprocessingml/2006/main" xmlns:w10="urn:schemas-microsoft-com:office:word" xmlns:wp="http://schemas.openxmlformats.org/drawingml/2006/wordprocessingDrawing" xmlns:wps="http://schemas.microsoft.com/office/word/2010/wordprocessingShape" xmlns:wpg="http://schemas.microsoft.com/office/word/2010/wordprocessingGroup" xmlns:mc="http://schemas.openxmlformats.org/markup-compatibility/2006" xmlns:wp14="http://schemas.microsoft.com/office/word/2010/wordprocessingDrawing" xmlns:w14="http://schemas.microsoft.com/office/word/2010/wordml" xmlns:w15="http://schemas.microsoft.com/office/word/2012/wordml" mc:Ignorable="w14 wp14 w15">
   <w:p>
     <w:pPr>
       <w:pStyle w:val="Footer"/>
@@ -2174,7 +2262,7 @@
         <w:szCs w:val="16"/>
         <w:bCs/>
       </w:rPr>
-      <w:instrText> PAGE </w:instrText>
+      <w:instrText xml:space="preserve"> PAGE </w:instrText>
     </w:r>
     <w:r>
       <w:rPr>
@@ -2226,7 +2314,7 @@
         <w:szCs w:val="16"/>
         <w:bCs/>
       </w:rPr>
-      <w:instrText> NUMPAGES </w:instrText>
+      <w:instrText xml:space="preserve"> NUMPAGES </w:instrText>
     </w:r>
     <w:r>
       <w:rPr>
@@ -2260,7 +2348,7 @@
 </file>
 
 <file path=word/footer2.xml><?xml version="1.0" encoding="utf-8"?>
-<w:ftr xmlns:o="urn:schemas-microsoft-com:office:office" xmlns:r="http://schemas.openxmlformats.org/officeDocument/2006/relationships" xmlns:v="urn:schemas-microsoft-com:vml" xmlns:w="http://schemas.openxmlformats.org/wordprocessingml/2006/main" xmlns:w10="urn:schemas-microsoft-com:office:word" xmlns:wp="http://schemas.openxmlformats.org/drawingml/2006/wordprocessingDrawing" xmlns:wps="http://schemas.microsoft.com/office/word/2010/wordprocessingShape" xmlns:wpg="http://schemas.microsoft.com/office/word/2010/wordprocessingGroup" xmlns:mc="http://schemas.openxmlformats.org/markup-compatibility/2006" xmlns:wp14="http://schemas.microsoft.com/office/word/2010/wordprocessingDrawing" xmlns:w14="http://schemas.microsoft.com/office/word/2010/wordml" mc:Ignorable="w14 wp14">
+<w:ftr xmlns:o="urn:schemas-microsoft-com:office:office" xmlns:r="http://schemas.openxmlformats.org/officeDocument/2006/relationships" xmlns:v="urn:schemas-microsoft-com:vml" xmlns:w="http://schemas.openxmlformats.org/wordprocessingml/2006/main" xmlns:w10="urn:schemas-microsoft-com:office:word" xmlns:wp="http://schemas.openxmlformats.org/drawingml/2006/wordprocessingDrawing" xmlns:wps="http://schemas.microsoft.com/office/word/2010/wordprocessingShape" xmlns:wpg="http://schemas.microsoft.com/office/word/2010/wordprocessingGroup" xmlns:mc="http://schemas.openxmlformats.org/markup-compatibility/2006" xmlns:wp14="http://schemas.microsoft.com/office/word/2010/wordprocessingDrawing" xmlns:w14="http://schemas.microsoft.com/office/word/2010/wordml" xmlns:w15="http://schemas.microsoft.com/office/word/2012/wordml" mc:Ignorable="w14 wp14 w15">
   <w:p>
     <w:pPr>
       <w:pStyle w:val="Footer"/>
@@ -2293,7 +2381,7 @@
         <w:szCs w:val="16"/>
         <w:bCs/>
       </w:rPr>
-      <w:instrText> PAGE </w:instrText>
+      <w:instrText xml:space="preserve"> PAGE </w:instrText>
     </w:r>
     <w:r>
       <w:rPr>
@@ -2345,7 +2433,7 @@
         <w:szCs w:val="16"/>
         <w:bCs/>
       </w:rPr>
-      <w:instrText> NUMPAGES </w:instrText>
+      <w:instrText xml:space="preserve"> NUMPAGES </w:instrText>
     </w:r>
     <w:r>
       <w:rPr>
@@ -2379,7 +2467,7 @@
 </file>
 
 <file path=word/header1.xml><?xml version="1.0" encoding="utf-8"?>
-<w:hdr xmlns:o="urn:schemas-microsoft-com:office:office" xmlns:r="http://schemas.openxmlformats.org/officeDocument/2006/relationships" xmlns:v="urn:schemas-microsoft-com:vml" xmlns:w="http://schemas.openxmlformats.org/wordprocessingml/2006/main" xmlns:w10="urn:schemas-microsoft-com:office:word" xmlns:wp="http://schemas.openxmlformats.org/drawingml/2006/wordprocessingDrawing" xmlns:wps="http://schemas.microsoft.com/office/word/2010/wordprocessingShape" xmlns:wpg="http://schemas.microsoft.com/office/word/2010/wordprocessingGroup" xmlns:mc="http://schemas.openxmlformats.org/markup-compatibility/2006" xmlns:wp14="http://schemas.microsoft.com/office/word/2010/wordprocessingDrawing" xmlns:w14="http://schemas.microsoft.com/office/word/2010/wordml" mc:Ignorable="w14 wp14">
+<w:hdr xmlns:o="urn:schemas-microsoft-com:office:office" xmlns:r="http://schemas.openxmlformats.org/officeDocument/2006/relationships" xmlns:v="urn:schemas-microsoft-com:vml" xmlns:w="http://schemas.openxmlformats.org/wordprocessingml/2006/main" xmlns:w10="urn:schemas-microsoft-com:office:word" xmlns:wp="http://schemas.openxmlformats.org/drawingml/2006/wordprocessingDrawing" xmlns:wps="http://schemas.microsoft.com/office/word/2010/wordprocessingShape" xmlns:wpg="http://schemas.microsoft.com/office/word/2010/wordprocessingGroup" xmlns:mc="http://schemas.openxmlformats.org/markup-compatibility/2006" xmlns:wp14="http://schemas.microsoft.com/office/word/2010/wordprocessingDrawing" xmlns:w14="http://schemas.microsoft.com/office/word/2010/wordml" xmlns:w15="http://schemas.microsoft.com/office/word/2012/wordml" mc:Ignorable="w14 wp14 w15">
   <w:p>
     <w:pPr>
       <w:pStyle w:val="Header"/>
@@ -2394,7 +2482,7 @@
 </file>
 
 <file path=word/header2.xml><?xml version="1.0" encoding="utf-8"?>
-<w:hdr xmlns:o="urn:schemas-microsoft-com:office:office" xmlns:r="http://schemas.openxmlformats.org/officeDocument/2006/relationships" xmlns:v="urn:schemas-microsoft-com:vml" xmlns:w="http://schemas.openxmlformats.org/wordprocessingml/2006/main" xmlns:w10="urn:schemas-microsoft-com:office:word" xmlns:wp="http://schemas.openxmlformats.org/drawingml/2006/wordprocessingDrawing" xmlns:wps="http://schemas.microsoft.com/office/word/2010/wordprocessingShape" xmlns:wpg="http://schemas.microsoft.com/office/word/2010/wordprocessingGroup" xmlns:mc="http://schemas.openxmlformats.org/markup-compatibility/2006" xmlns:wp14="http://schemas.microsoft.com/office/word/2010/wordprocessingDrawing" xmlns:w14="http://schemas.microsoft.com/office/word/2010/wordml" mc:Ignorable="w14 wp14">
+<w:hdr xmlns:o="urn:schemas-microsoft-com:office:office" xmlns:r="http://schemas.openxmlformats.org/officeDocument/2006/relationships" xmlns:v="urn:schemas-microsoft-com:vml" xmlns:w="http://schemas.openxmlformats.org/wordprocessingml/2006/main" xmlns:w10="urn:schemas-microsoft-com:office:word" xmlns:wp="http://schemas.openxmlformats.org/drawingml/2006/wordprocessingDrawing" xmlns:wps="http://schemas.microsoft.com/office/word/2010/wordprocessingShape" xmlns:wpg="http://schemas.microsoft.com/office/word/2010/wordprocessingGroup" xmlns:mc="http://schemas.openxmlformats.org/markup-compatibility/2006" xmlns:wp14="http://schemas.microsoft.com/office/word/2010/wordprocessingDrawing" xmlns:w14="http://schemas.microsoft.com/office/word/2010/wordml" xmlns:w15="http://schemas.microsoft.com/office/word/2012/wordml" mc:Ignorable="w14 wp14 w15">
   <w:p>
     <w:pPr>
       <w:pStyle w:val="Header"/>
@@ -2969,7 +3057,6 @@
   <w:style w:type="character" w:styleId="CommentTextChar" w:customStyle="1">
     <w:name w:val="Comment Text Char"/>
     <w:basedOn w:val="DefaultParagraphFont"/>
-    <w:link w:val="CommentText"/>
     <w:uiPriority w:val="99"/>
     <w:qFormat/>
     <w:rPr>
@@ -2981,7 +3068,6 @@
   <w:style w:type="character" w:styleId="CommentSubjectChar" w:customStyle="1">
     <w:name w:val="Comment Subject Char"/>
     <w:basedOn w:val="CommentTextChar"/>
-    <w:link w:val="CommentSubject"/>
     <w:uiPriority w:val="99"/>
     <w:semiHidden/>
     <w:qFormat/>
@@ -3264,7 +3350,6 @@
     <w:semiHidden/>
     <w:unhideWhenUsed/>
     <w:tblPr>
-      <w:tblInd w:w="0" w:type="dxa"/>
       <w:tblCellMar>
         <w:top w:w="0" w:type="dxa"/>
         <w:left w:w="108" w:type="dxa"/>

</xml_diff>